<commit_message>
Update Word docx document to simple Taglish version for Hirna Mobility system architecture
</commit_message>
<xml_diff>
--- a/public/downloads/Hirna_Team7_System_Architecture_and_Integration_Process.docx
+++ b/public/downloads/Hirna_Team7_System_Architecture_and_Integration_Process.docx
@@ -21,9 +21,11 @@
           <w:rFonts w:ascii="Arial" w:hAnsi="Arial"/>
           <w:b/>
           <w:color w:val="CE2029"/>
-          <w:sz w:val="40"/>
+          <w:sz w:val="36"/>
         </w:rPr>
         <w:t>SYSTEM ARCHITECTURE &amp; MODULE INTEGRATION PROCESS</w:t>
+        <w:br/>
+        <w:t>(TAGLISH VERSION)</w:t>
       </w:r>
     </w:p>
     <w:p>
@@ -35,7 +37,7 @@
           <w:rFonts w:ascii="Arial" w:hAnsi="Arial"/>
           <w:i/>
           <w:color w:val="7F1D1D"/>
-          <w:sz w:val="22"/>
+          <w:sz w:val="20"/>
         </w:rPr>
         <w:t>Team 7: Fleet and Transportation Management System with AI-Based Fuel Consumption Prediction and Transport Cost Analysis</w:t>
         <w:br/>
@@ -48,16 +50,16 @@
     </w:p>
     <w:p>
       <w:pPr>
-        <w:spacing w:before="360" w:after="120"/>
+        <w:spacing w:before="320" w:after="120"/>
       </w:pPr>
       <w:r>
         <w:rPr>
           <w:rFonts w:ascii="Arial" w:hAnsi="Arial"/>
           <w:b/>
           <w:color w:val="CE2029"/>
-          <w:sz w:val="28"/>
+          <w:sz w:val="26"/>
         </w:rPr>
-        <w:t>1. EXECUTIVE SUMMARY &amp; OVERALL SYSTEM PROCESS</w:t>
+        <w:t>1. PANGKALAHATANG ALOY AT PROSESO NG SISTEMA (OVERVIEW)</w:t>
       </w:r>
     </w:p>
     <w:p>
@@ -68,9 +70,9 @@
         <w:rPr>
           <w:rFonts w:ascii="Arial" w:hAnsi="Arial"/>
           <w:color w:val="282828"/>
-          <w:sz w:val="22"/>
+          <w:sz w:val="21"/>
         </w:rPr>
-        <w:t>The Fleet and Transportation Management System (Team 7) for Hirna Mobility Solutions Inc. operates as a unified, closed-loop enterprise platform. It automates the entire vehicle lifecycle—from driver onboarding and vehicle dispatch to live Leaflet GPS telematics tracking, AI-based multi-fuel prediction, preventive maintenance logging, and real-time Transport Cost Analysis &amp; Optimization (TCAO).</w:t>
+        <w:t>Ang Fleet and Transportation Management System (Team 7) para sa Hirna Mobility Solutions Inc. ay isang kumpletong web application na nag-a-automate ng buong biyahe at maintenance ng mga sasakyan. Mula sa pagre-register ng sasakyan at driver, pag-set up ng dispatch reservation, live GPS map tracking, AI prediction ng gasolina/diesel/EV battery, hanggang sa preventive maintenance (PMS) at Transport Cost Analysis (TCAO), lahat ay automatic na natsu-swipe at nako-compute.</w:t>
       </w:r>
     </w:p>
     <w:p>
@@ -81,23 +83,23 @@
         <w:rPr>
           <w:rFonts w:ascii="Arial" w:hAnsi="Arial"/>
           <w:color w:val="282828"/>
-          <w:sz w:val="22"/>
+          <w:sz w:val="21"/>
         </w:rPr>
-        <w:t>By continuously synthesizing live telemetry streams with historical vehicle databases, the system replaces manual spreadsheet tracking with automated data pipelines. It supports multi-fuel operations, including Gasoline (Gas), Diesel, and Electric Vehicles (EVs), as well as Hirna Traysikel 3-wheelers across Metro Manila and Davao transit corridors.</w:t>
+        <w:t>Imbes na gumamit ng lumang manual Excel spreadsheets, automatic na nagpapasahan ng live data ang bawat module sa system. Suportado nito ang iba't ibang uri ng fuel tulad ng Gasoline (Gas), Diesel, at Electric (EV), kasama na ang mga Hirna Taxis, Vans, MPVs, at Hirna Traysikel 3-wheelers sa Metro Manila at Davao.</w:t>
       </w:r>
     </w:p>
     <w:p>
       <w:pPr>
-        <w:spacing w:before="360" w:after="120"/>
+        <w:spacing w:before="320" w:after="120"/>
       </w:pPr>
       <w:r>
         <w:rPr>
           <w:rFonts w:ascii="Arial" w:hAnsi="Arial"/>
           <w:b/>
           <w:color w:val="CE2029"/>
-          <w:sz w:val="28"/>
+          <w:sz w:val="26"/>
         </w:rPr>
-        <w:t>2. INTERNAL MODULE INTERCONNECTIONS (TEAM 7)</w:t>
+        <w:t>2. PAANO NAG-UUSAP ANG MGA MODULE SA LOOB NG TEAM 7</w:t>
       </w:r>
     </w:p>
     <w:p>
@@ -108,9 +110,9 @@
         <w:rPr>
           <w:rFonts w:ascii="Arial" w:hAnsi="Arial"/>
           <w:color w:val="282828"/>
-          <w:sz w:val="22"/>
+          <w:sz w:val="21"/>
         </w:rPr>
-        <w:t>Team 7 consists of seven core modules that communicate dynamically to ensure operational transparency and financial precision:</w:t>
+        <w:t>Mayroong 7 main modules ang Team 7 na tuloy-tuloy na nagpapalitan ng impormasyon para maging transparent at accurate ang daily operations:</w:t>
       </w:r>
     </w:p>
     <w:tbl>
@@ -151,7 +153,7 @@
                 <w:b/>
                 <w:color w:val="FFFFFF"/>
               </w:rPr>
-              <w:t>Primary Function</w:t>
+              <w:t>Main na Gawain</w:t>
             </w:r>
           </w:p>
         </w:tc>
@@ -166,7 +168,7 @@
                 <w:b/>
                 <w:color w:val="FFFFFF"/>
               </w:rPr>
-              <w:t>Internal System Connections</w:t>
+              <w:t>Paano Kumokonekta sa Ibang Module</w:t>
             </w:r>
           </w:p>
         </w:tc>
@@ -179,7 +181,7 @@
           <w:p>
             <w:r>
               <w:rPr>
-                <w:sz w:val="20"/>
+                <w:sz w:val="19"/>
               </w:rPr>
               <w:t>1. Fleet &amp; Vehicle Management (FVM)</w:t>
             </w:r>
@@ -192,9 +194,9 @@
           <w:p>
             <w:r>
               <w:rPr>
-                <w:sz w:val="20"/>
+                <w:sz w:val="19"/>
               </w:rPr>
-              <w:t>Central registry for vehicles (Sedans, SUVs, Vans, Traysikel, EVs) &amp; driver profiles.</w:t>
+              <w:t>Central listahan ng lahat ng sasakyan (Hirna Taxis, Vans, MPVs, Traysikel) at driver profiles.</w:t>
             </w:r>
           </w:p>
         </w:tc>
@@ -205,9 +207,9 @@
           <w:p>
             <w:r>
               <w:rPr>
-                <w:sz w:val="20"/>
+                <w:sz w:val="19"/>
               </w:rPr>
-              <w:t>Feeds vehicle status (Active, Maintenance, Offline) to Reservation &amp; Dispatch.</w:t>
+              <w:t>Ipinapasa ang status ng sasakyan (Active, Maintenance, Offline) sa Dispatch module. Hindi pwedeng i-dispatch kapag naka-Maintenance.</w:t>
             </w:r>
           </w:p>
         </w:tc>
@@ -220,7 +222,7 @@
           <w:p>
             <w:r>
               <w:rPr>
-                <w:sz w:val="20"/>
+                <w:sz w:val="19"/>
               </w:rPr>
               <w:t>2. Vehicle Reservation &amp; Dispatch (VRD)</w:t>
             </w:r>
@@ -233,9 +235,9 @@
           <w:p>
             <w:r>
               <w:rPr>
-                <w:sz w:val="20"/>
+                <w:sz w:val="19"/>
               </w:rPr>
-              <w:t>Pairs available vehicles with drivers and manages 2-step reservation approvals.</w:t>
+              <w:t>Pinapares ang available na sasakyan sa tamang driver at gumagawa ng unique Booking Reference ID.</w:t>
             </w:r>
           </w:p>
         </w:tc>
@@ -246,9 +248,9 @@
           <w:p>
             <w:r>
               <w:rPr>
-                <w:sz w:val="20"/>
+                <w:sz w:val="19"/>
               </w:rPr>
-              <w:t>Sends trip coordinates and Booking Reference IDs to Route Planning and Live GPS Telemetry.</w:t>
+              <w:t>Ipinapasa ang approved dispatch details sa Route Planning at Live GPS Telemetry map.</w:t>
             </w:r>
           </w:p>
         </w:tc>
@@ -261,7 +263,7 @@
           <w:p>
             <w:r>
               <w:rPr>
-                <w:sz w:val="20"/>
+                <w:sz w:val="19"/>
               </w:rPr>
               <w:t>3. Route Planning &amp; Optimization (RPO)</w:t>
             </w:r>
@@ -274,9 +276,9 @@
           <w:p>
             <w:r>
               <w:rPr>
-                <w:sz w:val="20"/>
+                <w:sz w:val="19"/>
               </w:rPr>
-              <w:t>Calculates 3 eco-route options (Eco, Highway, City Bypass) for Gas, Diesel, &amp; EV.</w:t>
+              <w:t>Kina-calculate ang 3 pinakamagandang ruta (Eco, Highway, City Bypass) para sa Gas, Diesel, at EV.</w:t>
             </w:r>
           </w:p>
         </w:tc>
@@ -287,9 +289,9 @@
           <w:p>
             <w:r>
               <w:rPr>
-                <w:sz w:val="20"/>
+                <w:sz w:val="19"/>
               </w:rPr>
-              <w:t>Sends estimated distance and traffic congestion levels to the AI Fuel Predictor engine.</w:t>
+              <w:t>Ipinapasa ang estimated kilometro at trapik sa AI Fuel Predictor engine bago bumiyahe.</w:t>
             </w:r>
           </w:p>
         </w:tc>
@@ -302,7 +304,7 @@
           <w:p>
             <w:r>
               <w:rPr>
-                <w:sz w:val="20"/>
+                <w:sz w:val="19"/>
               </w:rPr>
               <w:t>4. Driver &amp; Trip Performance (DTPM)</w:t>
             </w:r>
@@ -315,9 +317,9 @@
           <w:p>
             <w:r>
               <w:rPr>
-                <w:sz w:val="20"/>
+                <w:sz w:val="19"/>
               </w:rPr>
-              <w:t>Tracks live GPS speed, idling time, and penalizes driver safety scores (100% baseline).</w:t>
+              <w:t>Naka-live GPS tracking sa bilis (km/h), idling time, at driver eco-safety score (100% baseline).</w:t>
             </w:r>
           </w:p>
         </w:tc>
@@ -328,9 +330,9 @@
           <w:p>
             <w:r>
               <w:rPr>
-                <w:sz w:val="20"/>
+                <w:sz w:val="19"/>
               </w:rPr>
-              <w:t>Triggers maintenance alerts to PMS when recurring speeding or harsh braking events occur.</w:t>
+              <w:t>Nagse-send ng alert sa Maintenance (PMS) kapag paulit-ulit ang speeding o harsh braking ng driver.</w:t>
             </w:r>
           </w:p>
         </w:tc>
@@ -343,7 +345,7 @@
           <w:p>
             <w:r>
               <w:rPr>
-                <w:sz w:val="20"/>
+                <w:sz w:val="19"/>
               </w:rPr>
               <w:t>5. Fuel Management System (FMS)</w:t>
             </w:r>
@@ -356,9 +358,9 @@
           <w:p>
             <w:r>
               <w:rPr>
-                <w:sz w:val="20"/>
+                <w:sz w:val="19"/>
               </w:rPr>
-              <w:t>Logs refueling/charging events, stores unit prices (₱/L or ₱/kWh), and trains ML model.</w:t>
+              <w:t>Nagtatala ng gas/diesel refill at EV charging receipts kasama ang presyo (₱/L o ₱/kWh).</w:t>
             </w:r>
           </w:p>
         </w:tc>
@@ -369,9 +371,9 @@
           <w:p>
             <w:r>
               <w:rPr>
-                <w:sz w:val="20"/>
+                <w:sz w:val="19"/>
               </w:rPr>
-              <w:t>Feeds real-time fuel and energy expenditure data to the Transport Cost Analysis engine.</w:t>
+              <w:t>Ipinapasa ang kabuuang gastos sa gasolina at kuryente diretso sa Transport Cost Analysis (TCAO).</w:t>
             </w:r>
           </w:p>
         </w:tc>
@@ -384,7 +386,7 @@
           <w:p>
             <w:r>
               <w:rPr>
-                <w:sz w:val="20"/>
+                <w:sz w:val="19"/>
               </w:rPr>
               <w:t>6. Preventive Maintenance (PMS)</w:t>
             </w:r>
@@ -397,9 +399,9 @@
           <w:p>
             <w:r>
               <w:rPr>
-                <w:sz w:val="20"/>
+                <w:sz w:val="19"/>
               </w:rPr>
-              <w:t>Schedules tune-ups, logs repair expenses, and manages service statuses.</w:t>
+              <w:t>Nag-aayos ng maintenance schedule (oil change, tire alignment) at repair expenses.</w:t>
             </w:r>
           </w:p>
         </w:tc>
@@ -410,9 +412,9 @@
           <w:p>
             <w:r>
               <w:rPr>
-                <w:sz w:val="20"/>
+                <w:sz w:val="19"/>
               </w:rPr>
-              <w:t>Automatically updates vehicle status to 'Maintenance' when service begins, and 'Active' when completed.</w:t>
+              <w:t>Awtomatikong ginagawang 'Maintenance' ang status ng sasakyan habang inaayos, at 'Active' kapag natapos na.</w:t>
             </w:r>
           </w:p>
         </w:tc>
@@ -425,7 +427,7 @@
           <w:p>
             <w:r>
               <w:rPr>
-                <w:sz w:val="20"/>
+                <w:sz w:val="19"/>
               </w:rPr>
               <w:t>7. Transport Cost Analysis (TCAO)</w:t>
             </w:r>
@@ -438,9 +440,9 @@
           <w:p>
             <w:r>
               <w:rPr>
-                <w:sz w:val="20"/>
+                <w:sz w:val="19"/>
               </w:rPr>
-              <w:t>Central financial dashboard calculating Cost-Per-KM (CPK), net profits, and PDF audits.</w:t>
+              <w:t>Main finance dashboard na nagco-compute ng Cost-Per-Kilometer (CPK), net profit margin, at PDF audit reports.</w:t>
             </w:r>
           </w:p>
         </w:tc>
@@ -451,9 +453,9 @@
           <w:p>
             <w:r>
               <w:rPr>
-                <w:sz w:val="20"/>
+                <w:sz w:val="19"/>
               </w:rPr>
-              <w:t>Aggregates fuel logs, trip distances, and PMS repair costs from all upstream modules.</w:t>
+              <w:t>Pina-process ang lahat ng datos mula sa fuel logs, trip distance, at PMS repair costs para makita ang kita at gastos.</w:t>
             </w:r>
           </w:p>
         </w:tc>
@@ -466,16 +468,16 @@
     </w:p>
     <w:p>
       <w:pPr>
-        <w:spacing w:before="360" w:after="120"/>
+        <w:spacing w:before="320" w:after="120"/>
       </w:pPr>
       <w:r>
         <w:rPr>
           <w:rFonts w:ascii="Arial" w:hAnsi="Arial"/>
           <w:b/>
           <w:color w:val="CE2029"/>
-          <w:sz w:val="28"/>
+          <w:sz w:val="26"/>
         </w:rPr>
-        <w:t>3. EXTERNAL PEER INTEGRATION PIPELINES (TEAMS 5, 6, 8, 9, &amp; 10)</w:t>
+        <w:t>3. KONEKSYON NG TEAM 7 SA IBANG ENTERPRISE TEAMS (APIs)</w:t>
       </w:r>
     </w:p>
     <w:p>
@@ -486,9 +488,9 @@
         <w:rPr>
           <w:rFonts w:ascii="Arial" w:hAnsi="Arial"/>
           <w:color w:val="282828"/>
-          <w:sz w:val="22"/>
+          <w:sz w:val="21"/>
         </w:rPr>
-        <w:t>Team 7 integrates seamlessly with five peer enterprise systems via automated RESTful APIs (/api/v1/*) to enable end-to-end enterprise synchronization:</w:t>
+        <w:t>Automatic ding kumokonekta ang Team 7 sa 5 ibang enterprise system sa pamamagitan ng RESTful APIs (/api/v1/*):</w:t>
       </w:r>
     </w:p>
     <w:tbl>
@@ -514,7 +516,7 @@
                 <w:b/>
                 <w:color w:val="FFFFFF"/>
               </w:rPr>
-              <w:t>Peer System</w:t>
+              <w:t>Kasamang Team</w:t>
             </w:r>
           </w:p>
         </w:tc>
@@ -544,7 +546,7 @@
                 <w:b/>
                 <w:color w:val="FFFFFF"/>
               </w:rPr>
-              <w:t>Integration Workflow &amp; Data Exchange</w:t>
+              <w:t>Paano Nagpapalitan ng Data</w:t>
             </w:r>
           </w:p>
         </w:tc>
@@ -557,7 +559,7 @@
           <w:p>
             <w:r>
               <w:rPr>
-                <w:sz w:val="20"/>
+                <w:sz w:val="19"/>
               </w:rPr>
               <w:t>Team 9: HRMS &amp; Payroll</w:t>
             </w:r>
@@ -570,7 +572,7 @@
           <w:p>
             <w:r>
               <w:rPr>
-                <w:sz w:val="20"/>
+                <w:sz w:val="19"/>
               </w:rPr>
               <w:t>/api/v1/hrms/*</w:t>
               <w:br/>
@@ -585,9 +587,9 @@
           <w:p>
             <w:r>
               <w:rPr>
-                <w:sz w:val="20"/>
+                <w:sz w:val="19"/>
               </w:rPr>
-              <w:t>Verifies driver licenses and employment status. Exports monthly Driver Eco-Safety Scores (100% baseline) for payroll performance bonuses or penalties.</w:t>
+              <w:t>Bina-validate ang lisensya ng driver sa HRMS. Ipinapasa ang Driver Eco-Safety Scores (100% baseline) sa Payroll para sa bonus (kapag maingat mag-drive) o bawas penalty (kapag harsh mag-drive).</w:t>
             </w:r>
           </w:p>
         </w:tc>
@@ -600,7 +602,7 @@
           <w:p>
             <w:r>
               <w:rPr>
-                <w:sz w:val="20"/>
+                <w:sz w:val="19"/>
               </w:rPr>
               <w:t>Team 10: CRM &amp; Passenger Portal</w:t>
             </w:r>
@@ -613,7 +615,7 @@
           <w:p>
             <w:r>
               <w:rPr>
-                <w:sz w:val="20"/>
+                <w:sz w:val="19"/>
               </w:rPr>
               <w:t>/api/v1/crm/*</w:t>
             </w:r>
@@ -626,9 +628,9 @@
           <w:p>
             <w:r>
               <w:rPr>
-                <w:sz w:val="20"/>
+                <w:sz w:val="19"/>
               </w:rPr>
-              <w:t>Receives passenger booking requests from Team 10, pairs an available driver/vehicle, and pushes live trip dispatch status back to the CRM.</w:t>
+              <w:t>Natatanggap ang booking ng pasahero mula sa Team 10, nag-a-assign ng magagamit na driver/sasakyan, at nagpapadala ng live trip status pabalik sa CRM.</w:t>
             </w:r>
           </w:p>
         </w:tc>
@@ -641,7 +643,7 @@
           <w:p>
             <w:r>
               <w:rPr>
-                <w:sz w:val="20"/>
+                <w:sz w:val="19"/>
               </w:rPr>
               <w:t>Team 5: Financials AP/GL</w:t>
             </w:r>
@@ -654,7 +656,7 @@
           <w:p>
             <w:r>
               <w:rPr>
-                <w:sz w:val="20"/>
+                <w:sz w:val="19"/>
               </w:rPr>
               <w:t>/api/v1/finance/*</w:t>
             </w:r>
@@ -667,9 +669,9 @@
           <w:p>
             <w:r>
               <w:rPr>
-                <w:sz w:val="20"/>
+                <w:sz w:val="19"/>
               </w:rPr>
-              <w:t>Pushes all logged fuel purchases (Gas/Diesel) and EV charging expenses to Team 5 General Ledger (GL). Sends maintenance invoices to Accounts Payable (AP).</w:t>
+              <w:t>Ipinapasa ang lahat ng resibo ng gasolina at EV charging sa General Ledger (GL) ni Team 5. Ang mga PMS maintenance bills naman ay pinadadala sa Accounts Payable (AP).</w:t>
             </w:r>
           </w:p>
         </w:tc>
@@ -682,7 +684,7 @@
           <w:p>
             <w:r>
               <w:rPr>
-                <w:sz w:val="20"/>
+                <w:sz w:val="19"/>
               </w:rPr>
               <w:t>Team 6: Supply Chain (PR)</w:t>
             </w:r>
@@ -695,7 +697,7 @@
           <w:p>
             <w:r>
               <w:rPr>
-                <w:sz w:val="20"/>
+                <w:sz w:val="19"/>
               </w:rPr>
               <w:t>/api/v1/supply-chain/*</w:t>
             </w:r>
@@ -708,9 +710,9 @@
           <w:p>
             <w:r>
               <w:rPr>
-                <w:sz w:val="20"/>
+                <w:sz w:val="19"/>
               </w:rPr>
-              <w:t>Automatically generates Purchase Requisitions (PR) for replacement vehicle spare parts (brake pads, oil, tires) when PMS maintenance is scheduled.</w:t>
+              <w:t>Awtomatikong nag-o-order ng Purchase Requisition (PR) para sa mga ekstrang pyesa (brake pads, langis, gulong) sa Supply Chain ni Team 6 kapag may scheduled PMS maintenance.</w:t>
             </w:r>
           </w:p>
         </w:tc>
@@ -723,7 +725,7 @@
           <w:p>
             <w:r>
               <w:rPr>
-                <w:sz w:val="20"/>
+                <w:sz w:val="19"/>
               </w:rPr>
               <w:t>Team 8: Facilities &amp; Hubs</w:t>
             </w:r>
@@ -736,7 +738,7 @@
           <w:p>
             <w:r>
               <w:rPr>
-                <w:sz w:val="20"/>
+                <w:sz w:val="19"/>
               </w:rPr>
               <w:t>/api/v1/facilities/*</w:t>
             </w:r>
@@ -749,9 +751,9 @@
           <w:p>
             <w:r>
               <w:rPr>
-                <w:sz w:val="20"/>
+                <w:sz w:val="19"/>
               </w:rPr>
-              <w:t>Syncs transit hub coordinates (Manila Port, NAIA, BGC, Davao Hubs) and reserves depot charging station bays for fleet vehicles.</w:t>
+              <w:t>Kina-kuha ang eksaktong GPS coordinates ng mga terminal hubs (Manila Port, NAIA, BGC, Davao Hubs) at nagre-reserve ng parking at charging bays para sa fleet vehicles.</w:t>
             </w:r>
           </w:p>
         </w:tc>
@@ -764,16 +766,16 @@
     </w:p>
     <w:p>
       <w:pPr>
-        <w:spacing w:before="360" w:after="120"/>
+        <w:spacing w:before="320" w:after="120"/>
       </w:pPr>
       <w:r>
         <w:rPr>
           <w:rFonts w:ascii="Arial" w:hAnsi="Arial"/>
           <w:b/>
           <w:color w:val="CE2029"/>
-          <w:sz w:val="28"/>
+          <w:sz w:val="26"/>
         </w:rPr>
-        <w:t>4. STRATEGIC SYSTEM ADVANTAGES FOR HIRNA MOBILITY</w:t>
+        <w:t>4. MGA BENEPISYO SA HIRNA MOBILITY SOLUTIONS</w:t>
       </w:r>
     </w:p>
     <w:p>
@@ -784,9 +786,9 @@
         <w:rPr>
           <w:rFonts w:ascii="Arial" w:hAnsi="Arial"/>
           <w:color w:val="282828"/>
-          <w:sz w:val="22"/>
+          <w:sz w:val="21"/>
         </w:rPr>
-        <w:t>• 100% Dynamic Operations: Eliminates manual spreadsheets through automated RESTful API pipelines and live database updates.</w:t>
+        <w:t>• Automatic at Walang Manual Excel: Mabilis ang pamamahala dahil direkta at live na nag-a-update ang mga datos sa database.</w:t>
       </w:r>
     </w:p>
     <w:p>
@@ -797,9 +799,9 @@
         <w:rPr>
           <w:rFonts w:ascii="Arial" w:hAnsi="Arial"/>
           <w:color w:val="282828"/>
-          <w:sz w:val="22"/>
+          <w:sz w:val="21"/>
         </w:rPr>
-        <w:t>• Multi-Fuel &amp; 3-Wheeler Versatility: Supports Taxis (Gasoline/Diesel), VinFast EVs, and Hirna Traysikel 3-wheelers with custom fuel consumption multipliers.</w:t>
+        <w:t>• Hiyang sa Gas, Diesel, EV, at Traysikel: Nakadisenyo para sa lahat ng uri ng biyahe—mula sa Hirna Taxis, Vans, hanggang sa 3-wheeler Hirna Traysikel.</w:t>
       </w:r>
     </w:p>
     <w:p>
@@ -810,9 +812,9 @@
         <w:rPr>
           <w:rFonts w:ascii="Arial" w:hAnsi="Arial"/>
           <w:color w:val="282828"/>
-          <w:sz w:val="22"/>
+          <w:sz w:val="21"/>
         </w:rPr>
-        <w:t>• Data-Driven Cost Optimization: Equips managers with real-time Cost-Per-KM (CPK), trip profit margins, and exportable CSV/PDF audit summaries.</w:t>
+        <w:t>• Malinaw na Kita at Gastos (CPK): May real-time Cost-Per-KM at exportable CSV/PDF audit summaries para madaling makapagdesisyon ang pamunuan.</w:t>
       </w:r>
     </w:p>
     <w:sectPr>

</xml_diff>

<commit_message>
Add complete Teams 1 to 10 and HR 1-4 integration mapping in Taglish Word document
</commit_message>
<xml_diff>
--- a/public/downloads/Hirna_Team7_System_Architecture_and_Integration_Process.docx
+++ b/public/downloads/Hirna_Team7_System_Architecture_and_Integration_Process.docx
@@ -23,7 +23,7 @@
           <w:color w:val="CE2029"/>
           <w:sz w:val="36"/>
         </w:rPr>
-        <w:t>SYSTEM ARCHITECTURE &amp; MODULE INTEGRATION PROCESS</w:t>
+        <w:t>COMPLETE ENTERPRISE SYSTEM ARCHITECTURE &amp; MODULE INTEGRATION PROCESS</w:t>
         <w:br/>
         <w:t>(TAGLISH VERSION)</w:t>
       </w:r>
@@ -39,7 +39,7 @@
           <w:color w:val="7F1D1D"/>
           <w:sz w:val="20"/>
         </w:rPr>
-        <w:t>Team 7: Fleet and Transportation Management System with AI-Based Fuel Consumption Prediction and Transport Cost Analysis</w:t>
+        <w:t>Team 7: Fleet and Transportation Management System (Complete Integration with Teams 1 to 10 &amp; HR 1–4)</w:t>
         <w:br/>
       </w:r>
     </w:p>
@@ -72,7 +72,7 @@
           <w:color w:val="282828"/>
           <w:sz w:val="21"/>
         </w:rPr>
-        <w:t>Ang Fleet and Transportation Management System (Team 7) para sa Hirna Mobility Solutions Inc. ay isang kumpletong web application na nag-a-automate ng buong biyahe at maintenance ng mga sasakyan. Mula sa pagre-register ng sasakyan at driver, pag-set up ng dispatch reservation, live GPS map tracking, AI prediction ng gasolina/diesel/EV battery, hanggang sa preventive maintenance (PMS) at Transport Cost Analysis (TCAO), lahat ay automatic na natsu-swipe at nako-compute.</w:t>
+        <w:t>Ang Fleet and Transportation Management System (Team 7) para sa Hirna Mobility Solutions Inc. ay ang sentral na nag-a-automate ng buong fleet operations. Kumokonekta ito sa lahat ng kasamang enterprise teams—mula sa HR Management Systems (Teams 1 hanggang 4), Financial Accounting (Team 5), Supply Chain &amp; Inventory (Team 6), Facilities &amp; Hubs (Team 8), Operations (Team 9), at Passenger CRM Booking (Team 10).</w:t>
       </w:r>
     </w:p>
     <w:p>
@@ -85,7 +85,7 @@
           <w:color w:val="282828"/>
           <w:sz w:val="21"/>
         </w:rPr>
-        <w:t>Imbes na gumamit ng lumang manual Excel spreadsheets, automatic na nagpapasahan ng live data ang bawat module sa system. Suportado nito ang iba't ibang uri ng fuel tulad ng Gasoline (Gas), Diesel, at Electric (EV), kasama na ang mga Hirna Taxis, Vans, MPVs, at Hirna Traysikel 3-wheelers sa Metro Manila at Davao.</w:t>
+        <w:t>Kina-calculate atina-track ng Team 7 ang buong biyahe ng sasakyan—mula sa pag-verify ng bagong hire na driver mula sa HR, pagre-reserve ng sasakyan sa dispatch, live Leaflet GPS tracking, AI prediction ng gasolina/diesel/EV battery, hanggang sa preventive maintenance (PMS) at real-time Transport Cost Analysis (TCAO).</w:t>
       </w:r>
     </w:p>
     <w:p>
@@ -112,7 +112,7 @@
           <w:color w:val="282828"/>
           <w:sz w:val="21"/>
         </w:rPr>
-        <w:t>Mayroong 7 main modules ang Team 7 na tuloy-tuloy na nagpapalitan ng impormasyon para maging transparent at accurate ang daily operations:</w:t>
+        <w:t>Mayroong 7 main modules ang Team 7 na tuloy-tuloy na nagpapalitan ng datos para maging transparent at accurate ang daily operations:</w:t>
       </w:r>
     </w:p>
     <w:tbl>
@@ -477,7 +477,7 @@
           <w:color w:val="CE2029"/>
           <w:sz w:val="26"/>
         </w:rPr>
-        <w:t>3. KONEKSYON NG TEAM 7 SA IBANG ENTERPRISE TEAMS (APIs)</w:t>
+        <w:t>3. KUMPLETONG INTEGRATION SA LAHAT NG TEAMS (TEAMS 1 TO 10 &amp; HR 1 TO 4)</w:t>
       </w:r>
     </w:p>
     <w:p>
@@ -490,7 +490,7 @@
           <w:color w:val="282828"/>
           <w:sz w:val="21"/>
         </w:rPr>
-        <w:t>Automatic ding kumokonekta ang Team 7 sa 5 ibang enterprise system sa pamamagitan ng RESTful APIs (/api/v1/*):</w:t>
+        <w:t>Narito ang kumpleto at detalyadong koneksyon ng Team 7 sa LAHAT ng iba pang enterprise teams sa buong sistema:</w:t>
       </w:r>
     </w:p>
     <w:tbl>
@@ -516,7 +516,7 @@
                 <w:b/>
                 <w:color w:val="FFFFFF"/>
               </w:rPr>
-              <w:t>Kasamang Team</w:t>
+              <w:t>Enterprise Team / Module</w:t>
             </w:r>
           </w:p>
         </w:tc>
@@ -546,7 +546,7 @@
                 <w:b/>
                 <w:color w:val="FFFFFF"/>
               </w:rPr>
-              <w:t>Paano Nagpapalitan ng Data</w:t>
+              <w:t>Paano Nagpapalitan ng Data (Integration Flow)</w:t>
             </w:r>
           </w:p>
         </w:tc>
@@ -559,9 +559,9 @@
           <w:p>
             <w:r>
               <w:rPr>
-                <w:sz w:val="19"/>
+                <w:sz w:val="18"/>
               </w:rPr>
-              <w:t>Team 9: HRMS &amp; Payroll</w:t>
+              <w:t>Team 1: HR Recruitment &amp; Onboarding</w:t>
             </w:r>
           </w:p>
         </w:tc>
@@ -572,11 +572,9 @@
           <w:p>
             <w:r>
               <w:rPr>
-                <w:sz w:val="19"/>
+                <w:sz w:val="18"/>
               </w:rPr>
-              <w:t>/api/v1/hrms/*</w:t>
-              <w:br/>
-              <w:t>/api/v1/payroll/*</w:t>
+              <w:t>POST /api/hr/sync-driver</w:t>
             </w:r>
           </w:p>
         </w:tc>
@@ -587,9 +585,9 @@
           <w:p>
             <w:r>
               <w:rPr>
-                <w:sz w:val="19"/>
+                <w:sz w:val="18"/>
               </w:rPr>
-              <w:t>Bina-validate ang lisensya ng driver sa HRMS. Ipinapasa ang Driver Eco-Safety Scores (100% baseline) sa Payroll para sa bonus (kapag maingat mag-drive) o bawas penalty (kapag harsh mag-drive).</w:t>
+              <w:t>Kapag nakapasa at na-hire ang bagong driver sa Team 1 HR, automatic nitong ina-add ang driver account sa driver roster ng Team 7.</w:t>
             </w:r>
           </w:p>
         </w:tc>
@@ -602,9 +600,9 @@
           <w:p>
             <w:r>
               <w:rPr>
-                <w:sz w:val="19"/>
+                <w:sz w:val="18"/>
               </w:rPr>
-              <w:t>Team 10: CRM &amp; Passenger Portal</w:t>
+              <w:t>Team 2: HR Training &amp; Certification</w:t>
             </w:r>
           </w:p>
         </w:tc>
@@ -615,9 +613,9 @@
           <w:p>
             <w:r>
               <w:rPr>
-                <w:sz w:val="19"/>
+                <w:sz w:val="18"/>
               </w:rPr>
-              <w:t>/api/v1/crm/*</w:t>
+              <w:t>POST /api/hr/sync-driver</w:t>
             </w:r>
           </w:p>
         </w:tc>
@@ -628,9 +626,9 @@
           <w:p>
             <w:r>
               <w:rPr>
-                <w:sz w:val="19"/>
+                <w:sz w:val="18"/>
               </w:rPr>
-              <w:t>Natatanggap ang booking ng pasahero mula sa Team 10, nag-a-assign ng magagamit na driver/sasakyan, at nagpapadala ng live trip status pabalik sa CRM.</w:t>
+              <w:t>Ipina-pasa ang safety training status at driving certification clearance bago payagang bumiyahe ang driver sa Team 7.</w:t>
             </w:r>
           </w:p>
         </w:tc>
@@ -643,9 +641,9 @@
           <w:p>
             <w:r>
               <w:rPr>
-                <w:sz w:val="19"/>
+                <w:sz w:val="18"/>
               </w:rPr>
-              <w:t>Team 5: Financials AP/GL</w:t>
+              <w:t>Team 3: HR Attendance &amp; Shift Roster</w:t>
             </w:r>
           </w:p>
         </w:tc>
@@ -656,9 +654,9 @@
           <w:p>
             <w:r>
               <w:rPr>
-                <w:sz w:val="19"/>
+                <w:sz w:val="18"/>
               </w:rPr>
-              <w:t>/api/v1/finance/*</w:t>
+              <w:t>POST /api/hr/sync-driver</w:t>
             </w:r>
           </w:p>
         </w:tc>
@@ -669,9 +667,9 @@
           <w:p>
             <w:r>
               <w:rPr>
-                <w:sz w:val="19"/>
+                <w:sz w:val="18"/>
               </w:rPr>
-              <w:t>Ipinapasa ang lahat ng resibo ng gasolina at EV charging sa General Ledger (GL) ni Team 5. Ang mga PMS maintenance bills naman ay pinadadala sa Accounts Payable (AP).</w:t>
+              <w:t>Ipinapasa ang daily duty shifts at attendance. Tanging ang mga driver na 'Checked-In' lang ang magiging eligible sa Team 7 Dispatch.</w:t>
             </w:r>
           </w:p>
         </w:tc>
@@ -684,9 +682,9 @@
           <w:p>
             <w:r>
               <w:rPr>
-                <w:sz w:val="19"/>
+                <w:sz w:val="18"/>
               </w:rPr>
-              <w:t>Team 6: Supply Chain (PR)</w:t>
+              <w:t>Team 4: HR Performance &amp; Evaluation</w:t>
             </w:r>
           </w:p>
         </w:tc>
@@ -697,9 +695,9 @@
           <w:p>
             <w:r>
               <w:rPr>
-                <w:sz w:val="19"/>
+                <w:sz w:val="18"/>
               </w:rPr>
-              <w:t>/api/v1/supply-chain/*</w:t>
+              <w:t>GET /api/hr/driver-performance</w:t>
             </w:r>
           </w:p>
         </w:tc>
@@ -710,9 +708,9 @@
           <w:p>
             <w:r>
               <w:rPr>
-                <w:sz w:val="19"/>
+                <w:sz w:val="18"/>
               </w:rPr>
-              <w:t>Awtomatikong nag-o-order ng Purchase Requisition (PR) para sa mga ekstrang pyesa (brake pads, langis, gulong) sa Supply Chain ni Team 6 kapag may scheduled PMS maintenance.</w:t>
+              <w:t>Kina-kuha mula sa Team 7 ang monthly Driver Eco-Safety Scores (100% baseline), bilang ng harsh braking, at speeding events para sa HR performance review.</w:t>
             </w:r>
           </w:p>
         </w:tc>
@@ -725,9 +723,9 @@
           <w:p>
             <w:r>
               <w:rPr>
-                <w:sz w:val="19"/>
+                <w:sz w:val="18"/>
               </w:rPr>
-              <w:t>Team 8: Facilities &amp; Hubs</w:t>
+              <w:t>Team 5: Financials AP / GL Accounting</w:t>
             </w:r>
           </w:p>
         </w:tc>
@@ -738,9 +736,9 @@
           <w:p>
             <w:r>
               <w:rPr>
-                <w:sz w:val="19"/>
+                <w:sz w:val="18"/>
               </w:rPr>
-              <w:t>/api/v1/facilities/*</w:t>
+              <w:t>GET /api/finance/expenses</w:t>
             </w:r>
           </w:p>
         </w:tc>
@@ -751,9 +749,177 @@
           <w:p>
             <w:r>
               <w:rPr>
-                <w:sz w:val="19"/>
+                <w:sz w:val="18"/>
               </w:rPr>
-              <w:t>Kina-kuha ang eksaktong GPS coordinates ng mga terminal hubs (Manila Port, NAIA, BGC, Davao Hubs) at nagre-reserve ng parking at charging bays para sa fleet vehicles.</w:t>
+              <w:t>Ipinapasa ng Team 7 ang lahat ng resibo ng gasolina, diesel, at EV charging sa General Ledger (GL), at ang maintenance invoices sa Accounts Payable (AP).</w:t>
+            </w:r>
+          </w:p>
+        </w:tc>
+      </w:tr>
+      <w:tr>
+        <w:tc>
+          <w:tcPr>
+            <w:tcW w:type="dxa" w:w="3120"/>
+          </w:tcPr>
+          <w:p>
+            <w:r>
+              <w:rPr>
+                <w:sz w:val="18"/>
+              </w:rPr>
+              <w:t>Team 6: Supply Chain &amp; Inventory</w:t>
+            </w:r>
+          </w:p>
+        </w:tc>
+        <w:tc>
+          <w:tcPr>
+            <w:tcW w:type="dxa" w:w="3120"/>
+          </w:tcPr>
+          <w:p>
+            <w:r>
+              <w:rPr>
+                <w:sz w:val="18"/>
+              </w:rPr>
+              <w:t>POST /api/inventory/fuel-stock</w:t>
+              <w:br/>
+              <w:t>GET /api/inventory/fuel-usage</w:t>
+            </w:r>
+          </w:p>
+        </w:tc>
+        <w:tc>
+          <w:tcPr>
+            <w:tcW w:type="dxa" w:w="3120"/>
+          </w:tcPr>
+          <w:p>
+            <w:r>
+              <w:rPr>
+                <w:sz w:val="18"/>
+              </w:rPr>
+              <w:t>Kina-kuha ang live fuel inventory stock mula kay Team 6. Automatic ding nag-o-order ng Purchase Requisition (PR) para sa pyesa (gulong, langis, brake pads) kapag nag-PMS maintenance.</w:t>
+            </w:r>
+          </w:p>
+        </w:tc>
+      </w:tr>
+      <w:tr>
+        <w:tc>
+          <w:tcPr>
+            <w:tcW w:type="dxa" w:w="3120"/>
+          </w:tcPr>
+          <w:p>
+            <w:r>
+              <w:rPr>
+                <w:sz w:val="18"/>
+              </w:rPr>
+              <w:t>Team 8: Facilities &amp; Hub Management</w:t>
+            </w:r>
+          </w:p>
+        </w:tc>
+        <w:tc>
+          <w:tcPr>
+            <w:tcW w:type="dxa" w:w="3120"/>
+          </w:tcPr>
+          <w:p>
+            <w:r>
+              <w:rPr>
+                <w:sz w:val="18"/>
+              </w:rPr>
+              <w:t>GET /api/v1/facilities/*</w:t>
+            </w:r>
+          </w:p>
+        </w:tc>
+        <w:tc>
+          <w:tcPr>
+            <w:tcW w:type="dxa" w:w="3120"/>
+          </w:tcPr>
+          <w:p>
+            <w:r>
+              <w:rPr>
+                <w:sz w:val="18"/>
+              </w:rPr>
+              <w:t>Kina-kuha ang eksaktong GPS coordinates ng mga terminal hubs (Manila Port, NAIA, BGC, Davao Hubs) at nagre-reserve ng parking/charging bays para sa fleet vehicles.</w:t>
+            </w:r>
+          </w:p>
+        </w:tc>
+      </w:tr>
+      <w:tr>
+        <w:tc>
+          <w:tcPr>
+            <w:tcW w:type="dxa" w:w="3120"/>
+          </w:tcPr>
+          <w:p>
+            <w:r>
+              <w:rPr>
+                <w:sz w:val="18"/>
+              </w:rPr>
+              <w:t>Team 9: Operations System</w:t>
+            </w:r>
+          </w:p>
+        </w:tc>
+        <w:tc>
+          <w:tcPr>
+            <w:tcW w:type="dxa" w:w="3120"/>
+          </w:tcPr>
+          <w:p>
+            <w:r>
+              <w:rPr>
+                <w:sz w:val="18"/>
+              </w:rPr>
+              <w:t>POST /api/operations/trip-request</w:t>
+              <w:br/>
+              <w:t>GET /api/operations/vehicle-availability</w:t>
+            </w:r>
+          </w:p>
+        </w:tc>
+        <w:tc>
+          <w:tcPr>
+            <w:tcW w:type="dxa" w:w="3120"/>
+          </w:tcPr>
+          <w:p>
+            <w:r>
+              <w:rPr>
+                <w:sz w:val="18"/>
+              </w:rPr>
+              <w:t>Natatanggap ang mga internal trip requests mula sa Operations at ipinapadala pabalik ang listahan ng available at active Hirna vehicles.</w:t>
+            </w:r>
+          </w:p>
+        </w:tc>
+      </w:tr>
+      <w:tr>
+        <w:tc>
+          <w:tcPr>
+            <w:tcW w:type="dxa" w:w="3120"/>
+          </w:tcPr>
+          <w:p>
+            <w:r>
+              <w:rPr>
+                <w:sz w:val="18"/>
+              </w:rPr>
+              <w:t>Team 10: CRM &amp; Passenger Booking Portal</w:t>
+            </w:r>
+          </w:p>
+        </w:tc>
+        <w:tc>
+          <w:tcPr>
+            <w:tcW w:type="dxa" w:w="3120"/>
+          </w:tcPr>
+          <w:p>
+            <w:r>
+              <w:rPr>
+                <w:sz w:val="18"/>
+              </w:rPr>
+              <w:t>POST /api/booking/assign-trip</w:t>
+            </w:r>
+          </w:p>
+        </w:tc>
+        <w:tc>
+          <w:tcPr>
+            <w:tcW w:type="dxa" w:w="3120"/>
+          </w:tcPr>
+          <w:p>
+            <w:r>
+              <w:rPr>
+                <w:sz w:val="18"/>
+              </w:rPr>
+              <w:t>Natatanggap ang ride booking ng pasahero mula sa Team 10, automatic na nag-a-assign ng driver/sasakyan, at nag-e-stream ng live Leaflet GPS location at ETA pabalik sa passenger app.</w:t>
             </w:r>
           </w:p>
         </w:tc>
@@ -788,7 +954,7 @@
           <w:color w:val="282828"/>
           <w:sz w:val="21"/>
         </w:rPr>
-        <w:t>• Automatic at Walang Manual Excel: Mabilis ang pamamahala dahil direkta at live na nag-a-update ang mga datos sa database.</w:t>
+        <w:t>• 100% Automatic at Kumpletong Koneksyon: Nakakabit sa LAHAT ng Teams (HR 1-4, Finance 5, Inventory 6, Facilities 8, Operations 9, at Booking 10).</w:t>
       </w:r>
     </w:p>
     <w:p>
@@ -801,7 +967,7 @@
           <w:color w:val="282828"/>
           <w:sz w:val="21"/>
         </w:rPr>
-        <w:t>• Hiyang sa Gas, Diesel, EV, at Traysikel: Nakadisenyo para sa lahat ng uri ng biyahe—mula sa Hirna Taxis, Vans, hanggang sa 3-wheeler Hirna Traysikel.</w:t>
+        <w:t>• Hiyang sa Gas, Diesel, EV, at Traysikel: Nakadisenyo para sa lahat ng uri ng biyahe—mula sa Hirna Taxis, Vans, MPVs, hanggang sa 3-wheeler Hirna Traysikel.</w:t>
       </w:r>
     </w:p>
     <w:p>

</xml_diff>

<commit_message>
Sync Word docx document with official TNVS Enterprise Teams 1 to 10 architecture matrix
</commit_message>
<xml_diff>
--- a/public/downloads/Hirna_Team7_System_Architecture_and_Integration_Process.docx
+++ b/public/downloads/Hirna_Team7_System_Architecture_and_Integration_Process.docx
@@ -23,7 +23,7 @@
           <w:color w:val="CE2029"/>
           <w:sz w:val="36"/>
         </w:rPr>
-        <w:t>COMPLETE ENTERPRISE SYSTEM ARCHITECTURE &amp; MODULE INTEGRATION PROCESS</w:t>
+        <w:t>OFFICIAL TNVS ENTERPRISE SYSTEM ARCHITECTURE &amp; INTEGRATION</w:t>
         <w:br/>
         <w:t>(TAGLISH VERSION)</w:t>
       </w:r>
@@ -39,7 +39,7 @@
           <w:color w:val="7F1D1D"/>
           <w:sz w:val="20"/>
         </w:rPr>
-        <w:t>Team 7: Fleet and Transportation Management System (Complete Integration with Teams 1 to 10 &amp; HR 1–4)</w:t>
+        <w:t>Team 7: Fleet &amp; Transportation Management (Matched with Teams 1 to 10 Specifications)</w:t>
         <w:br/>
       </w:r>
     </w:p>
@@ -59,7 +59,7 @@
           <w:color w:val="CE2029"/>
           <w:sz w:val="26"/>
         </w:rPr>
-        <w:t>1. PANGKALAHATANG ALOY AT PROSESO NG SISTEMA (OVERVIEW)</w:t>
+        <w:t>1. PANGKALAHATANG PROSESO NG SISTEMA (OVERVIEW)</w:t>
       </w:r>
     </w:p>
     <w:p>
@@ -72,20 +72,7 @@
           <w:color w:val="282828"/>
           <w:sz w:val="21"/>
         </w:rPr>
-        <w:t>Ang Fleet and Transportation Management System (Team 7) para sa Hirna Mobility Solutions Inc. ay ang sentral na nag-a-automate ng buong fleet operations. Kumokonekta ito sa lahat ng kasamang enterprise teams—mula sa HR Management Systems (Teams 1 hanggang 4), Financial Accounting (Team 5), Supply Chain &amp; Inventory (Team 6), Facilities &amp; Hubs (Team 8), Operations (Team 9), at Passenger CRM Booking (Team 10).</w:t>
-      </w:r>
-    </w:p>
-    <w:p>
-      <w:pPr>
-        <w:spacing w:after="120" w:line="276" w:lineRule="auto"/>
-      </w:pPr>
-      <w:r>
-        <w:rPr>
-          <w:rFonts w:ascii="Arial" w:hAnsi="Arial"/>
-          <w:color w:val="282828"/>
-          <w:sz w:val="21"/>
-        </w:rPr>
-        <w:t>Kina-calculate atina-track ng Team 7 ang buong biyahe ng sasakyan—mula sa pag-verify ng bagong hire na driver mula sa HR, pagre-reserve ng sasakyan sa dispatch, live Leaflet GPS tracking, AI prediction ng gasolina/diesel/EV battery, hanggang sa preventive maintenance (PMS) at real-time Transport Cost Analysis (TCAO).</w:t>
+        <w:t>Ang Fleet and Transportation Management System (Team 7) para sa Hirna Mobility Solutions Inc. ay ang sentral na nag-a-automate ng buong fleet operations. Nakakonekta ito sa lahat ng 10 enterprise system ng TNVS architecture—mula sa HRMS (Teams 1 hanggang 4), Financial Management (Team 5), Supply Chain &amp; Inventory (Team 6), Facilities (Team 8), TNVS Operations (Team 9), at Passenger Booking (Team 10).</w:t>
       </w:r>
     </w:p>
     <w:p>
@@ -99,7 +86,7 @@
           <w:color w:val="CE2029"/>
           <w:sz w:val="26"/>
         </w:rPr>
-        <w:t>2. PAANO NAG-UUSAP ANG MGA MODULE SA LOOB NG TEAM 7</w:t>
+        <w:t>2. MGA MODULE SA LOOB NG TEAM 7 (FLEET &amp; TRANSPORTATION MANAGEMENT)</w:t>
       </w:r>
     </w:p>
     <w:p>
@@ -112,7 +99,7 @@
           <w:color w:val="282828"/>
           <w:sz w:val="21"/>
         </w:rPr>
-        <w:t>Mayroong 7 main modules ang Team 7 na tuloy-tuloy na nagpapalitan ng datos para maging transparent at accurate ang daily operations:</w:t>
+        <w:t>Narito ang 7 core modules ng Team 7 na nakadisenyo para sa Hirna Mobility fleet operations:</w:t>
       </w:r>
     </w:p>
     <w:tbl>
@@ -153,7 +140,7 @@
                 <w:b/>
                 <w:color w:val="FFFFFF"/>
               </w:rPr>
-              <w:t>Main na Gawain</w:t>
+              <w:t>Pangunahing Gawain</w:t>
             </w:r>
           </w:p>
         </w:tc>
@@ -196,7 +183,7 @@
               <w:rPr>
                 <w:sz w:val="19"/>
               </w:rPr>
-              <w:t>Central listahan ng lahat ng sasakyan (Hirna Taxis, Vans, MPVs, Traysikel) at driver profiles.</w:t>
+              <w:t>Central listahan ng lahat ng sasakyan (Taxis, Vans, MPVs, Traysikel) at driver profiles.</w:t>
             </w:r>
           </w:p>
         </w:tc>
@@ -224,7 +211,7 @@
               <w:rPr>
                 <w:sz w:val="19"/>
               </w:rPr>
-              <w:t>2. Vehicle Reservation &amp; Dispatch (VRD)</w:t>
+              <w:t>2. Vehicle Reservation &amp; Dispatch System (VRDS)</w:t>
             </w:r>
           </w:p>
         </w:tc>
@@ -265,7 +252,130 @@
               <w:rPr>
                 <w:sz w:val="19"/>
               </w:rPr>
-              <w:t>3. Route Planning &amp; Optimization (RPO)</w:t>
+              <w:t>3. Driver and Trip Performance Monitoring</w:t>
+            </w:r>
+          </w:p>
+        </w:tc>
+        <w:tc>
+          <w:tcPr>
+            <w:tcW w:type="dxa" w:w="3120"/>
+          </w:tcPr>
+          <w:p>
+            <w:r>
+              <w:rPr>
+                <w:sz w:val="19"/>
+              </w:rPr>
+              <w:t>Naka-live GPS tracking sa bilis (km/h), idling time, at driver eco-safety score (100% baseline).</w:t>
+            </w:r>
+          </w:p>
+        </w:tc>
+        <w:tc>
+          <w:tcPr>
+            <w:tcW w:type="dxa" w:w="3120"/>
+          </w:tcPr>
+          <w:p>
+            <w:r>
+              <w:rPr>
+                <w:sz w:val="19"/>
+              </w:rPr>
+              <w:t>Nagse-send ng alert sa Maintenance (PMS) kapag paulit-ulit ang speeding o harsh braking ng driver.</w:t>
+            </w:r>
+          </w:p>
+        </w:tc>
+      </w:tr>
+      <w:tr>
+        <w:tc>
+          <w:tcPr>
+            <w:tcW w:type="dxa" w:w="3120"/>
+          </w:tcPr>
+          <w:p>
+            <w:r>
+              <w:rPr>
+                <w:sz w:val="19"/>
+              </w:rPr>
+              <w:t>4. Fuel Management System (added)</w:t>
+            </w:r>
+          </w:p>
+        </w:tc>
+        <w:tc>
+          <w:tcPr>
+            <w:tcW w:type="dxa" w:w="3120"/>
+          </w:tcPr>
+          <w:p>
+            <w:r>
+              <w:rPr>
+                <w:sz w:val="19"/>
+              </w:rPr>
+              <w:t>Nagtatala ng gas/diesel refill at EV charging receipts kasama ang presyo (₱/L o ₱/kWh).</w:t>
+            </w:r>
+          </w:p>
+        </w:tc>
+        <w:tc>
+          <w:tcPr>
+            <w:tcW w:type="dxa" w:w="3120"/>
+          </w:tcPr>
+          <w:p>
+            <w:r>
+              <w:rPr>
+                <w:sz w:val="19"/>
+              </w:rPr>
+              <w:t>Ipinapasa ang kabuuang gastos sa gasolina at kuryente diretso sa Transport Cost Analysis (TCAO).</w:t>
+            </w:r>
+          </w:p>
+        </w:tc>
+      </w:tr>
+      <w:tr>
+        <w:tc>
+          <w:tcPr>
+            <w:tcW w:type="dxa" w:w="3120"/>
+          </w:tcPr>
+          <w:p>
+            <w:r>
+              <w:rPr>
+                <w:sz w:val="19"/>
+              </w:rPr>
+              <w:t>5. Transport Cost Analysis &amp; Optimization (TCAO)</w:t>
+            </w:r>
+          </w:p>
+        </w:tc>
+        <w:tc>
+          <w:tcPr>
+            <w:tcW w:type="dxa" w:w="3120"/>
+          </w:tcPr>
+          <w:p>
+            <w:r>
+              <w:rPr>
+                <w:sz w:val="19"/>
+              </w:rPr>
+              <w:t>Main finance dashboard na nagco-compute ng Cost-Per-Kilometer (CPK), net profit margin, at PDF audit reports.</w:t>
+            </w:r>
+          </w:p>
+        </w:tc>
+        <w:tc>
+          <w:tcPr>
+            <w:tcW w:type="dxa" w:w="3120"/>
+          </w:tcPr>
+          <w:p>
+            <w:r>
+              <w:rPr>
+                <w:sz w:val="19"/>
+              </w:rPr>
+              <w:t>Pina-process ang lahat ng datos mula sa fuel logs, trip distance, at PMS repair costs para makita ang kita at gastos.</w:t>
+            </w:r>
+          </w:p>
+        </w:tc>
+      </w:tr>
+      <w:tr>
+        <w:tc>
+          <w:tcPr>
+            <w:tcW w:type="dxa" w:w="3120"/>
+          </w:tcPr>
+          <w:p>
+            <w:r>
+              <w:rPr>
+                <w:sz w:val="19"/>
+              </w:rPr>
+              <w:t>6. Route Planning &amp; Optimization (added)</w:t>
             </w:r>
           </w:p>
         </w:tc>
@@ -306,7 +416,7 @@
               <w:rPr>
                 <w:sz w:val="19"/>
               </w:rPr>
-              <w:t>4. Driver &amp; Trip Performance (DTPM)</w:t>
+              <w:t>7. Mobile Fleet Command App (Optional)</w:t>
             </w:r>
           </w:p>
         </w:tc>
@@ -319,7 +429,7 @@
               <w:rPr>
                 <w:sz w:val="19"/>
               </w:rPr>
-              <w:t>Naka-live GPS tracking sa bilis (km/h), idling time, at driver eco-safety score (100% baseline).</w:t>
+              <w:t>Mobile interface para sa mga fleet dispatchers at field supervisors.</w:t>
             </w:r>
           </w:p>
         </w:tc>
@@ -332,130 +442,7 @@
               <w:rPr>
                 <w:sz w:val="19"/>
               </w:rPr>
-              <w:t>Nagse-send ng alert sa Maintenance (PMS) kapag paulit-ulit ang speeding o harsh braking ng driver.</w:t>
-            </w:r>
-          </w:p>
-        </w:tc>
-      </w:tr>
-      <w:tr>
-        <w:tc>
-          <w:tcPr>
-            <w:tcW w:type="dxa" w:w="3120"/>
-          </w:tcPr>
-          <w:p>
-            <w:r>
-              <w:rPr>
-                <w:sz w:val="19"/>
-              </w:rPr>
-              <w:t>5. Fuel Management System (FMS)</w:t>
-            </w:r>
-          </w:p>
-        </w:tc>
-        <w:tc>
-          <w:tcPr>
-            <w:tcW w:type="dxa" w:w="3120"/>
-          </w:tcPr>
-          <w:p>
-            <w:r>
-              <w:rPr>
-                <w:sz w:val="19"/>
-              </w:rPr>
-              <w:t>Nagtatala ng gas/diesel refill at EV charging receipts kasama ang presyo (₱/L o ₱/kWh).</w:t>
-            </w:r>
-          </w:p>
-        </w:tc>
-        <w:tc>
-          <w:tcPr>
-            <w:tcW w:type="dxa" w:w="3120"/>
-          </w:tcPr>
-          <w:p>
-            <w:r>
-              <w:rPr>
-                <w:sz w:val="19"/>
-              </w:rPr>
-              <w:t>Ipinapasa ang kabuuang gastos sa gasolina at kuryente diretso sa Transport Cost Analysis (TCAO).</w:t>
-            </w:r>
-          </w:p>
-        </w:tc>
-      </w:tr>
-      <w:tr>
-        <w:tc>
-          <w:tcPr>
-            <w:tcW w:type="dxa" w:w="3120"/>
-          </w:tcPr>
-          <w:p>
-            <w:r>
-              <w:rPr>
-                <w:sz w:val="19"/>
-              </w:rPr>
-              <w:t>6. Preventive Maintenance (PMS)</w:t>
-            </w:r>
-          </w:p>
-        </w:tc>
-        <w:tc>
-          <w:tcPr>
-            <w:tcW w:type="dxa" w:w="3120"/>
-          </w:tcPr>
-          <w:p>
-            <w:r>
-              <w:rPr>
-                <w:sz w:val="19"/>
-              </w:rPr>
-              <w:t>Nag-aayos ng maintenance schedule (oil change, tire alignment) at repair expenses.</w:t>
-            </w:r>
-          </w:p>
-        </w:tc>
-        <w:tc>
-          <w:tcPr>
-            <w:tcW w:type="dxa" w:w="3120"/>
-          </w:tcPr>
-          <w:p>
-            <w:r>
-              <w:rPr>
-                <w:sz w:val="19"/>
-              </w:rPr>
-              <w:t>Awtomatikong ginagawang 'Maintenance' ang status ng sasakyan habang inaayos, at 'Active' kapag natapos na.</w:t>
-            </w:r>
-          </w:p>
-        </w:tc>
-      </w:tr>
-      <w:tr>
-        <w:tc>
-          <w:tcPr>
-            <w:tcW w:type="dxa" w:w="3120"/>
-          </w:tcPr>
-          <w:p>
-            <w:r>
-              <w:rPr>
-                <w:sz w:val="19"/>
-              </w:rPr>
-              <w:t>7. Transport Cost Analysis (TCAO)</w:t>
-            </w:r>
-          </w:p>
-        </w:tc>
-        <w:tc>
-          <w:tcPr>
-            <w:tcW w:type="dxa" w:w="3120"/>
-          </w:tcPr>
-          <w:p>
-            <w:r>
-              <w:rPr>
-                <w:sz w:val="19"/>
-              </w:rPr>
-              <w:t>Main finance dashboard na nagco-compute ng Cost-Per-Kilometer (CPK), net profit margin, at PDF audit reports.</w:t>
-            </w:r>
-          </w:p>
-        </w:tc>
-        <w:tc>
-          <w:tcPr>
-            <w:tcW w:type="dxa" w:w="3120"/>
-          </w:tcPr>
-          <w:p>
-            <w:r>
-              <w:rPr>
-                <w:sz w:val="19"/>
-              </w:rPr>
-              <w:t>Pina-process ang lahat ng datos mula sa fuel logs, trip distance, at PMS repair costs para makita ang kita at gastos.</w:t>
+              <w:t>Nagse-send ng real-time push alerts para sa vehicle dispatch at driver safety warnings.</w:t>
             </w:r>
           </w:p>
         </w:tc>
@@ -477,7 +464,7 @@
           <w:color w:val="CE2029"/>
           <w:sz w:val="26"/>
         </w:rPr>
-        <w:t>3. KUMPLETONG INTEGRATION SA LAHAT NG TEAMS (TEAMS 1 TO 10 &amp; HR 1 TO 4)</w:t>
+        <w:t>3. OPISYAL NA TNVS ENTERPRISE INTEGRATION MATRIX (TEAMS 1 TO 10)</w:t>
       </w:r>
     </w:p>
     <w:p>
@@ -490,7 +477,7 @@
           <w:color w:val="282828"/>
           <w:sz w:val="21"/>
         </w:rPr>
-        <w:t>Narito ang kumpleto at detalyadong koneksyon ng Team 7 sa LAHAT ng iba pang enterprise teams sa buong sistema:</w:t>
+        <w:t>Ayon sa opisyal na TNVS Enterprise Architecture, narito ang eksaktong koneksyon ng Team 7 sa lahat ng Teams (1 hanggang 10):</w:t>
       </w:r>
     </w:p>
     <w:tbl>
@@ -500,14 +487,15 @@
         <w:tblLook w:firstColumn="1" w:firstRow="1" w:lastColumn="0" w:lastRow="0" w:noHBand="0" w:noVBand="1" w:val="04A0"/>
       </w:tblPr>
       <w:tblGrid>
-        <w:gridCol w:w="3120"/>
-        <w:gridCol w:w="3120"/>
-        <w:gridCol w:w="3120"/>
+        <w:gridCol w:w="2340"/>
+        <w:gridCol w:w="2340"/>
+        <w:gridCol w:w="2340"/>
+        <w:gridCol w:w="2340"/>
       </w:tblGrid>
       <w:tr>
         <w:tc>
           <w:tcPr>
-            <w:tcW w:type="dxa" w:w="3120"/>
+            <w:tcW w:type="dxa" w:w="2340"/>
             <w:shd w:fill="7F1D1D"/>
           </w:tcPr>
           <w:p>
@@ -516,13 +504,13 @@
                 <w:b/>
                 <w:color w:val="FFFFFF"/>
               </w:rPr>
-              <w:t>Enterprise Team / Module</w:t>
+              <w:t>Enterprise System Cluster</w:t>
             </w:r>
           </w:p>
         </w:tc>
         <w:tc>
           <w:tcPr>
-            <w:tcW w:type="dxa" w:w="3120"/>
+            <w:tcW w:type="dxa" w:w="2340"/>
             <w:shd w:fill="7F1D1D"/>
           </w:tcPr>
           <w:p>
@@ -531,13 +519,13 @@
                 <w:b/>
                 <w:color w:val="FFFFFF"/>
               </w:rPr>
-              <w:t>API Endpoint</w:t>
+              <w:t>Team Number</w:t>
             </w:r>
           </w:p>
         </w:tc>
         <w:tc>
           <w:tcPr>
-            <w:tcW w:type="dxa" w:w="3120"/>
+            <w:tcW w:type="dxa" w:w="2340"/>
             <w:shd w:fill="7F1D1D"/>
           </w:tcPr>
           <w:p>
@@ -546,7 +534,22 @@
                 <w:b/>
                 <w:color w:val="FFFFFF"/>
               </w:rPr>
-              <w:t>Paano Nagpapalitan ng Data (Integration Flow)</w:t>
+              <w:t>Sub-Modules Included</w:t>
+            </w:r>
+          </w:p>
+        </w:tc>
+        <w:tc>
+          <w:tcPr>
+            <w:tcW w:type="dxa" w:w="2340"/>
+            <w:shd w:fill="7F1D1D"/>
+          </w:tcPr>
+          <w:p>
+            <w:r>
+              <w:rPr>
+                <w:b/>
+                <w:color w:val="FFFFFF"/>
+              </w:rPr>
+              <w:t>Koneksyon sa Team 7 (Integration Flow)</w:t>
             </w:r>
           </w:p>
         </w:tc>
@@ -554,40 +557,53 @@
       <w:tr>
         <w:tc>
           <w:tcPr>
-            <w:tcW w:type="dxa" w:w="3120"/>
+            <w:tcW w:type="dxa" w:w="2340"/>
           </w:tcPr>
           <w:p>
             <w:r>
               <w:rPr>
-                <w:sz w:val="18"/>
+                <w:sz w:val="17"/>
               </w:rPr>
-              <w:t>Team 1: HR Recruitment &amp; Onboarding</w:t>
+              <w:t>HRMS / HCM</w:t>
             </w:r>
           </w:p>
         </w:tc>
         <w:tc>
           <w:tcPr>
-            <w:tcW w:type="dxa" w:w="3120"/>
+            <w:tcW w:type="dxa" w:w="2340"/>
           </w:tcPr>
           <w:p>
             <w:r>
               <w:rPr>
-                <w:sz w:val="18"/>
+                <w:sz w:val="17"/>
               </w:rPr>
-              <w:t>POST /api/hr/sync-driver</w:t>
+              <w:t>TEAM 1</w:t>
             </w:r>
           </w:p>
         </w:tc>
         <w:tc>
           <w:tcPr>
-            <w:tcW w:type="dxa" w:w="3120"/>
+            <w:tcW w:type="dxa" w:w="2340"/>
           </w:tcPr>
           <w:p>
             <w:r>
               <w:rPr>
-                <w:sz w:val="18"/>
+                <w:sz w:val="17"/>
               </w:rPr>
-              <w:t>Kapag nakapasa at na-hire ang bagong driver sa Team 1 HR, automatic nitong ina-add ang driver account sa driver roster ng Team 7.</w:t>
+              <w:t>Recruitment &amp; Onboarding (Applicant &amp; Recruitment Mgmt, New Hire Onboarding) &amp; Core HR (HCM, ESS, Employee Records)</w:t>
+            </w:r>
+          </w:p>
+        </w:tc>
+        <w:tc>
+          <w:tcPr>
+            <w:tcW w:type="dxa" w:w="2340"/>
+          </w:tcPr>
+          <w:p>
+            <w:r>
+              <w:rPr>
+                <w:sz w:val="17"/>
+              </w:rPr>
+              <w:t>Kapag na-hire ang bagong driver sa Team 1, automatic nitong i-sy-sync ang bagong driver record sa Team 7 Driver Roster.</w:t>
             </w:r>
           </w:p>
         </w:tc>
@@ -595,40 +611,53 @@
       <w:tr>
         <w:tc>
           <w:tcPr>
-            <w:tcW w:type="dxa" w:w="3120"/>
+            <w:tcW w:type="dxa" w:w="2340"/>
           </w:tcPr>
           <w:p>
             <w:r>
               <w:rPr>
-                <w:sz w:val="18"/>
+                <w:sz w:val="17"/>
               </w:rPr>
-              <w:t>Team 2: HR Training &amp; Certification</w:t>
+              <w:t>HRMS / HCM</w:t>
             </w:r>
           </w:p>
         </w:tc>
         <w:tc>
           <w:tcPr>
-            <w:tcW w:type="dxa" w:w="3120"/>
+            <w:tcW w:type="dxa" w:w="2340"/>
           </w:tcPr>
           <w:p>
             <w:r>
               <w:rPr>
-                <w:sz w:val="18"/>
+                <w:sz w:val="17"/>
               </w:rPr>
-              <w:t>POST /api/hr/sync-driver</w:t>
+              <w:t>TEAM 2</w:t>
             </w:r>
           </w:p>
         </w:tc>
         <w:tc>
           <w:tcPr>
-            <w:tcW w:type="dxa" w:w="3120"/>
+            <w:tcW w:type="dxa" w:w="2340"/>
           </w:tcPr>
           <w:p>
             <w:r>
               <w:rPr>
-                <w:sz w:val="18"/>
+                <w:sz w:val="17"/>
               </w:rPr>
-              <w:t>Ipina-pasa ang safety training status at driving certification clearance bago payagang bumiyahe ang driver sa Team 7.</w:t>
+              <w:t>Workforce Management (Time &amp; Attendance, Shift &amp; Schedule Mgmt, Timesheet, Leave Mgmt, Workforce Analytics)</w:t>
+            </w:r>
+          </w:p>
+        </w:tc>
+        <w:tc>
+          <w:tcPr>
+            <w:tcW w:type="dxa" w:w="2340"/>
+          </w:tcPr>
+          <w:p>
+            <w:r>
+              <w:rPr>
+                <w:sz w:val="17"/>
+              </w:rPr>
+              <w:t>Ipinapasa ang daily attendance at shift schedules. Tanging ang mga driver na 'On-Duty' sa Team 2 ang pwedeng i-dispatch sa Team 7.</w:t>
             </w:r>
           </w:p>
         </w:tc>
@@ -636,40 +665,53 @@
       <w:tr>
         <w:tc>
           <w:tcPr>
-            <w:tcW w:type="dxa" w:w="3120"/>
+            <w:tcW w:type="dxa" w:w="2340"/>
           </w:tcPr>
           <w:p>
             <w:r>
               <w:rPr>
-                <w:sz w:val="18"/>
+                <w:sz w:val="17"/>
               </w:rPr>
-              <w:t>Team 3: HR Attendance &amp; Shift Roster</w:t>
+              <w:t>HRMS / HCM</w:t>
             </w:r>
           </w:p>
         </w:tc>
         <w:tc>
           <w:tcPr>
-            <w:tcW w:type="dxa" w:w="3120"/>
+            <w:tcW w:type="dxa" w:w="2340"/>
           </w:tcPr>
           <w:p>
             <w:r>
               <w:rPr>
-                <w:sz w:val="18"/>
+                <w:sz w:val="17"/>
               </w:rPr>
-              <w:t>POST /api/hr/sync-driver</w:t>
+              <w:t>TEAM 3</w:t>
             </w:r>
           </w:p>
         </w:tc>
         <w:tc>
           <w:tcPr>
-            <w:tcW w:type="dxa" w:w="3120"/>
+            <w:tcW w:type="dxa" w:w="2340"/>
           </w:tcPr>
           <w:p>
             <w:r>
               <w:rPr>
-                <w:sz w:val="18"/>
+                <w:sz w:val="17"/>
               </w:rPr>
-              <w:t>Ipinapasa ang daily duty shifts at attendance. Tanging ang mga driver na 'Checked-In' lang ang magiging eligible sa Team 7 Dispatch.</w:t>
+              <w:t>Performance &amp; Development (Performance, Competency, Learning, Training, Succession Planning, Social Recognition)</w:t>
+            </w:r>
+          </w:p>
+        </w:tc>
+        <w:tc>
+          <w:tcPr>
+            <w:tcW w:type="dxa" w:w="2340"/>
+          </w:tcPr>
+          <w:p>
+            <w:r>
+              <w:rPr>
+                <w:sz w:val="17"/>
+              </w:rPr>
+              <w:t>Ipina-pasa ang safety training certifications. Bina-validate ng Team 7 kung qualified ang driver bago i-assign sa biyahe.</w:t>
             </w:r>
           </w:p>
         </w:tc>
@@ -677,40 +719,53 @@
       <w:tr>
         <w:tc>
           <w:tcPr>
-            <w:tcW w:type="dxa" w:w="3120"/>
+            <w:tcW w:type="dxa" w:w="2340"/>
           </w:tcPr>
           <w:p>
             <w:r>
               <w:rPr>
-                <w:sz w:val="18"/>
+                <w:sz w:val="17"/>
               </w:rPr>
-              <w:t>Team 4: HR Performance &amp; Evaluation</w:t>
+              <w:t>HRMS / HCM</w:t>
             </w:r>
           </w:p>
         </w:tc>
         <w:tc>
           <w:tcPr>
-            <w:tcW w:type="dxa" w:w="3120"/>
+            <w:tcW w:type="dxa" w:w="2340"/>
           </w:tcPr>
           <w:p>
             <w:r>
               <w:rPr>
-                <w:sz w:val="18"/>
+                <w:sz w:val="17"/>
               </w:rPr>
-              <w:t>GET /api/hr/driver-performance</w:t>
+              <w:t>TEAM 4</w:t>
             </w:r>
           </w:p>
         </w:tc>
         <w:tc>
           <w:tcPr>
-            <w:tcW w:type="dxa" w:w="3120"/>
+            <w:tcW w:type="dxa" w:w="2340"/>
           </w:tcPr>
           <w:p>
             <w:r>
               <w:rPr>
-                <w:sz w:val="18"/>
+                <w:sz w:val="17"/>
               </w:rPr>
-              <w:t>Kina-kuha mula sa Team 7 ang monthly Driver Eco-Safety Scores (100% baseline), bilang ng harsh braking, at speeding events para sa HR performance review.</w:t>
+              <w:t>Payroll &amp; Benefits (Payroll Mgmt, Compensation Planning, Claims &amp; Reimbursement, HMO &amp; Benefits, HR Analytics)</w:t>
+            </w:r>
+          </w:p>
+        </w:tc>
+        <w:tc>
+          <w:tcPr>
+            <w:tcW w:type="dxa" w:w="2340"/>
+          </w:tcPr>
+          <w:p>
+            <w:r>
+              <w:rPr>
+                <w:sz w:val="17"/>
+              </w:rPr>
+              <w:t>Kina-kuha mula sa Team 7 ang monthly Driver Eco-Safety Scores (100% baseline) at safety violation logs para sa payroll bonuses o penalties.</w:t>
             </w:r>
           </w:p>
         </w:tc>
@@ -718,40 +773,53 @@
       <w:tr>
         <w:tc>
           <w:tcPr>
-            <w:tcW w:type="dxa" w:w="3120"/>
+            <w:tcW w:type="dxa" w:w="2340"/>
           </w:tcPr>
           <w:p>
             <w:r>
               <w:rPr>
-                <w:sz w:val="18"/>
+                <w:sz w:val="17"/>
               </w:rPr>
-              <w:t>Team 5: Financials AP / GL Accounting</w:t>
+              <w:t>Financial Management System</w:t>
             </w:r>
           </w:p>
         </w:tc>
         <w:tc>
           <w:tcPr>
-            <w:tcW w:type="dxa" w:w="3120"/>
+            <w:tcW w:type="dxa" w:w="2340"/>
           </w:tcPr>
           <w:p>
             <w:r>
               <w:rPr>
-                <w:sz w:val="18"/>
+                <w:sz w:val="17"/>
               </w:rPr>
-              <w:t>GET /api/finance/expenses</w:t>
+              <w:t>TEAM 5</w:t>
             </w:r>
           </w:p>
         </w:tc>
         <w:tc>
           <w:tcPr>
-            <w:tcW w:type="dxa" w:w="3120"/>
+            <w:tcW w:type="dxa" w:w="2340"/>
           </w:tcPr>
           <w:p>
             <w:r>
               <w:rPr>
-                <w:sz w:val="18"/>
+                <w:sz w:val="17"/>
               </w:rPr>
-              <w:t>Ipinapasa ng Team 7 ang lahat ng resibo ng gasolina, diesel, at EV charging sa General Ledger (GL), at ang maintenance invoices sa Accounts Payable (AP).</w:t>
+              <w:t>General Ledger, Accounts Payable (AP), Accounts Receivable (AR), Disbursement, Collection, Budget, Cash Mgmt, Tax Mgmt</w:t>
+            </w:r>
+          </w:p>
+        </w:tc>
+        <w:tc>
+          <w:tcPr>
+            <w:tcW w:type="dxa" w:w="2340"/>
+          </w:tcPr>
+          <w:p>
+            <w:r>
+              <w:rPr>
+                <w:sz w:val="17"/>
+              </w:rPr>
+              <w:t>Ipinapasa ng Team 7 ang lahat ng resibo ng gasolina/EV sa General Ledger (GL) at ang maintenance bills sa Accounts Payable (AP).</w:t>
             </w:r>
           </w:p>
         </w:tc>
@@ -759,42 +827,53 @@
       <w:tr>
         <w:tc>
           <w:tcPr>
-            <w:tcW w:type="dxa" w:w="3120"/>
+            <w:tcW w:type="dxa" w:w="2340"/>
           </w:tcPr>
           <w:p>
             <w:r>
               <w:rPr>
-                <w:sz w:val="18"/>
+                <w:sz w:val="17"/>
               </w:rPr>
-              <w:t>Team 6: Supply Chain &amp; Inventory</w:t>
+              <w:t>Supply Chain &amp; Inventory</w:t>
             </w:r>
           </w:p>
         </w:tc>
         <w:tc>
           <w:tcPr>
-            <w:tcW w:type="dxa" w:w="3120"/>
+            <w:tcW w:type="dxa" w:w="2340"/>
           </w:tcPr>
           <w:p>
             <w:r>
               <w:rPr>
-                <w:sz w:val="18"/>
+                <w:sz w:val="17"/>
               </w:rPr>
-              <w:t>POST /api/inventory/fuel-stock</w:t>
-              <w:br/>
-              <w:t>GET /api/inventory/fuel-usage</w:t>
+              <w:t>TEAM 6</w:t>
             </w:r>
           </w:p>
         </w:tc>
         <w:tc>
           <w:tcPr>
-            <w:tcW w:type="dxa" w:w="3120"/>
+            <w:tcW w:type="dxa" w:w="2340"/>
           </w:tcPr>
           <w:p>
             <w:r>
               <w:rPr>
-                <w:sz w:val="18"/>
+                <w:sz w:val="17"/>
               </w:rPr>
-              <w:t>Kina-kuha ang live fuel inventory stock mula kay Team 6. Automatic ding nag-o-order ng Purchase Requisition (PR) para sa pyesa (gulong, langis, brake pads) kapag nag-PMS maintenance.</w:t>
+              <w:t>Smart Warehousing (SWS), Inventory Mgmt, Procurement &amp; Sourcing (PSM), Supplier Mgmt, Purchase Order Mgmt, DTRS</w:t>
+            </w:r>
+          </w:p>
+        </w:tc>
+        <w:tc>
+          <w:tcPr>
+            <w:tcW w:type="dxa" w:w="2340"/>
+          </w:tcPr>
+          <w:p>
+            <w:r>
+              <w:rPr>
+                <w:sz w:val="17"/>
+              </w:rPr>
+              <w:t>Kina-kuha ang live fuel inventory stock. Automatic ding nag-o-order ng Purchase Requisition (PR) para sa pyesa (gulong, langis, brake pads) kapag nag-PMS.</w:t>
             </w:r>
           </w:p>
         </w:tc>
@@ -802,40 +881,55 @@
       <w:tr>
         <w:tc>
           <w:tcPr>
-            <w:tcW w:type="dxa" w:w="3120"/>
+            <w:tcW w:type="dxa" w:w="2340"/>
           </w:tcPr>
           <w:p>
             <w:r>
               <w:rPr>
-                <w:sz w:val="18"/>
+                <w:sz w:val="17"/>
               </w:rPr>
-              <w:t>Team 8: Facilities &amp; Hub Management</w:t>
+              <w:t>Fleet &amp; Transportation Management</w:t>
             </w:r>
           </w:p>
         </w:tc>
         <w:tc>
           <w:tcPr>
-            <w:tcW w:type="dxa" w:w="3120"/>
+            <w:tcW w:type="dxa" w:w="2340"/>
           </w:tcPr>
           <w:p>
             <w:r>
               <w:rPr>
-                <w:sz w:val="18"/>
+                <w:sz w:val="17"/>
               </w:rPr>
-              <w:t>GET /api/v1/facilities/*</w:t>
+              <w:t>TEAM 7</w:t>
+              <w:br/>
+              <w:t>(OUR SYSTEM)</w:t>
             </w:r>
           </w:p>
         </w:tc>
         <w:tc>
           <w:tcPr>
-            <w:tcW w:type="dxa" w:w="3120"/>
+            <w:tcW w:type="dxa" w:w="2340"/>
           </w:tcPr>
           <w:p>
             <w:r>
               <w:rPr>
-                <w:sz w:val="18"/>
+                <w:sz w:val="17"/>
               </w:rPr>
-              <w:t>Kina-kuha ang eksaktong GPS coordinates ng mga terminal hubs (Manila Port, NAIA, BGC, Davao Hubs) at nagre-reserve ng parking/charging bays para sa fleet vehicles.</w:t>
+              <w:t>Fleet &amp; Vehicle Mgmt (FVM), VRDS, Driver &amp; Trip Performance, Fuel Management System, TCAO, Route Planning, Mobile App</w:t>
+            </w:r>
+          </w:p>
+        </w:tc>
+        <w:tc>
+          <w:tcPr>
+            <w:tcW w:type="dxa" w:w="2340"/>
+          </w:tcPr>
+          <w:p>
+            <w:r>
+              <w:rPr>
+                <w:sz w:val="17"/>
+              </w:rPr>
+              <w:t>ANG ATING CENTRALISED SYSTEM: Nagco-control sa Vehicle Inventory, Dispatch, Leaflet GPS Telemetry, AI Fuel Prediction, at Cost Analysis.</w:t>
             </w:r>
           </w:p>
         </w:tc>
@@ -843,42 +937,53 @@
       <w:tr>
         <w:tc>
           <w:tcPr>
-            <w:tcW w:type="dxa" w:w="3120"/>
+            <w:tcW w:type="dxa" w:w="2340"/>
           </w:tcPr>
           <w:p>
             <w:r>
               <w:rPr>
-                <w:sz w:val="18"/>
+                <w:sz w:val="17"/>
               </w:rPr>
-              <w:t>Team 9: Operations System</w:t>
+              <w:t>Facilities &amp; Administrative</w:t>
             </w:r>
           </w:p>
         </w:tc>
         <w:tc>
           <w:tcPr>
-            <w:tcW w:type="dxa" w:w="3120"/>
+            <w:tcW w:type="dxa" w:w="2340"/>
           </w:tcPr>
           <w:p>
             <w:r>
               <w:rPr>
-                <w:sz w:val="18"/>
+                <w:sz w:val="17"/>
               </w:rPr>
-              <w:t>POST /api/operations/trip-request</w:t>
-              <w:br/>
-              <w:t>GET /api/operations/vehicle-availability</w:t>
+              <w:t>TEAM 8</w:t>
             </w:r>
           </w:p>
         </w:tc>
         <w:tc>
           <w:tcPr>
-            <w:tcW w:type="dxa" w:w="3120"/>
+            <w:tcW w:type="dxa" w:w="2340"/>
           </w:tcPr>
           <w:p>
             <w:r>
               <w:rPr>
-                <w:sz w:val="18"/>
+                <w:sz w:val="17"/>
               </w:rPr>
-              <w:t>Natatanggap ang mga internal trip requests mula sa Operations at ipinapadala pabalik ang listahan ng available at active Hirna vehicles.</w:t>
+              <w:t>Facilities Reservation, Visitor Mgmt, Document Mgmt (Archiving), Records Retention, Legal Mgmt, Contract Mgmt</w:t>
+            </w:r>
+          </w:p>
+        </w:tc>
+        <w:tc>
+          <w:tcPr>
+            <w:tcW w:type="dxa" w:w="2340"/>
+          </w:tcPr>
+          <w:p>
+            <w:r>
+              <w:rPr>
+                <w:sz w:val="17"/>
+              </w:rPr>
+              <w:t>Kina-kuha ang GPS coordinates ng terminal hubs at nagre-reserve ng parking at charging station bays para sa fleet vehicles.</w:t>
             </w:r>
           </w:p>
         </w:tc>
@@ -886,40 +991,107 @@
       <w:tr>
         <w:tc>
           <w:tcPr>
-            <w:tcW w:type="dxa" w:w="3120"/>
+            <w:tcW w:type="dxa" w:w="2340"/>
           </w:tcPr>
           <w:p>
             <w:r>
               <w:rPr>
-                <w:sz w:val="18"/>
+                <w:sz w:val="17"/>
               </w:rPr>
-              <w:t>Team 10: CRM &amp; Passenger Booking Portal</w:t>
+              <w:t>TNVS Operations &amp; Driver</w:t>
             </w:r>
           </w:p>
         </w:tc>
         <w:tc>
           <w:tcPr>
-            <w:tcW w:type="dxa" w:w="3120"/>
+            <w:tcW w:type="dxa" w:w="2340"/>
           </w:tcPr>
           <w:p>
             <w:r>
               <w:rPr>
-                <w:sz w:val="18"/>
+                <w:sz w:val="17"/>
               </w:rPr>
-              <w:t>POST /api/booking/assign-trip</w:t>
+              <w:t>TEAM 9</w:t>
             </w:r>
           </w:p>
         </w:tc>
         <w:tc>
           <w:tcPr>
-            <w:tcW w:type="dxa" w:w="3120"/>
+            <w:tcW w:type="dxa" w:w="2340"/>
           </w:tcPr>
           <w:p>
             <w:r>
               <w:rPr>
-                <w:sz w:val="18"/>
+                <w:sz w:val="17"/>
               </w:rPr>
-              <w:t>Natatanggap ang ride booking ng pasahero mula sa Team 10, automatic na nag-a-assign ng driver/sasakyan, at nag-e-stream ng live Leaflet GPS location at ETA pabalik sa passenger app.</w:t>
+              <w:t>Dispatching &amp; Trip Mgmt, Fleet Mgmt, Driver Information System, Driver Wallet &amp; Earnings, Fuel &amp; Consumables Mgmt</w:t>
+            </w:r>
+          </w:p>
+        </w:tc>
+        <w:tc>
+          <w:tcPr>
+            <w:tcW w:type="dxa" w:w="2340"/>
+          </w:tcPr>
+          <w:p>
+            <w:r>
+              <w:rPr>
+                <w:sz w:val="17"/>
+              </w:rPr>
+              <w:t>Natatanggap ang operational trip requests mula sa Team 9 at ipinapadala pabalik ang listahan ng magagamit at active Hirna vehicles.</w:t>
+            </w:r>
+          </w:p>
+        </w:tc>
+      </w:tr>
+      <w:tr>
+        <w:tc>
+          <w:tcPr>
+            <w:tcW w:type="dxa" w:w="2340"/>
+          </w:tcPr>
+          <w:p>
+            <w:r>
+              <w:rPr>
+                <w:sz w:val="17"/>
+              </w:rPr>
+              <w:t>TNVS Booking &amp; Payments</w:t>
+            </w:r>
+          </w:p>
+        </w:tc>
+        <w:tc>
+          <w:tcPr>
+            <w:tcW w:type="dxa" w:w="2340"/>
+          </w:tcPr>
+          <w:p>
+            <w:r>
+              <w:rPr>
+                <w:sz w:val="17"/>
+              </w:rPr>
+              <w:t>TEAM 10</w:t>
+            </w:r>
+          </w:p>
+        </w:tc>
+        <w:tc>
+          <w:tcPr>
+            <w:tcW w:type="dxa" w:w="2340"/>
+          </w:tcPr>
+          <w:p>
+            <w:r>
+              <w:rPr>
+                <w:sz w:val="17"/>
+              </w:rPr>
+              <w:t>Booking System (Web/Mobile), Payment &amp; Fare Collection, CRM, GPS Tracking &amp; Trip Playback, Transport Analytics, Audit Logs</w:t>
+            </w:r>
+          </w:p>
+        </w:tc>
+        <w:tc>
+          <w:tcPr>
+            <w:tcW w:type="dxa" w:w="2340"/>
+          </w:tcPr>
+          <w:p>
+            <w:r>
+              <w:rPr>
+                <w:sz w:val="17"/>
+              </w:rPr>
+              <w:t>Natatanggap ang ride booking ng pasahero mula sa Team 10, automatic na nag-a-assign ng driver/sasakyan, at nag-e-stream ng live GPS location.</w:t>
             </w:r>
           </w:p>
         </w:tc>
@@ -941,7 +1113,7 @@
           <w:color w:val="CE2029"/>
           <w:sz w:val="26"/>
         </w:rPr>
-        <w:t>4. MGA BENEPISYO SA HIRNA MOBILITY SOLUTIONS</w:t>
+        <w:t>4. MGA STRATEGIC BENEPISYO SA HIRNA MOBILITY SOLUTIONS</w:t>
       </w:r>
     </w:p>
     <w:p>
@@ -954,7 +1126,7 @@
           <w:color w:val="282828"/>
           <w:sz w:val="21"/>
         </w:rPr>
-        <w:t>• 100% Automatic at Kumpletong Koneksyon: Nakakabit sa LAHAT ng Teams (HR 1-4, Finance 5, Inventory 6, Facilities 8, Operations 9, at Booking 10).</w:t>
+        <w:t>• 100% Match sa Opisyal na TNVS Architecture: Eksaktong nakatugma sa Teams 1 hanggang 10 ng TNVS framework.</w:t>
       </w:r>
     </w:p>
     <w:p>
@@ -967,7 +1139,7 @@
           <w:color w:val="282828"/>
           <w:sz w:val="21"/>
         </w:rPr>
-        <w:t>• Hiyang sa Gas, Diesel, EV, at Traysikel: Nakadisenyo para sa lahat ng uri ng biyahe—mula sa Hirna Taxis, Vans, MPVs, hanggang sa 3-wheeler Hirna Traysikel.</w:t>
+        <w:t>• Automatic at Real-Time: Direktang nag-u-update sa database nang walang kailangang manual encoding sa Excel.</w:t>
       </w:r>
     </w:p>
     <w:p>
@@ -980,7 +1152,7 @@
           <w:color w:val="282828"/>
           <w:sz w:val="21"/>
         </w:rPr>
-        <w:t>• Malinaw na Kita at Gastos (CPK): May real-time Cost-Per-KM at exportable CSV/PDF audit summaries para madaling makapagdesisyon ang pamunuan.</w:t>
+        <w:t>• Hiyang sa Lahat ng Uri ng Sasakyan: Suportado ang Hirna Taxis, Vans, MPVs, at Hirna Traysikel 3-wheelers para sa Metro Manila at Davao.</w:t>
       </w:r>
     </w:p>
     <w:sectPr>

</xml_diff>